<commit_message>
Auto Daily 8:00 PM Dashboard Update [2026-10-07 08:20]
</commit_message>
<xml_diff>
--- a/docs/weekly/2026-W41_當週執行率回顧報告.docx
+++ b/docs/weekly/2026-W41_當週執行率回顧報告.docx
@@ -21,7 +21,7 @@
           <w:color w:val="555555"/>
           <w:sz w:val="20"/>
         </w:rPr>
-        <w:t>週期：2026/10/05–2026/10/11　｜　整體時間執行率：0.0%</w:t>
+        <w:t>週期：2026/10/05–2026/10/11　｜　整體時間執行率：11.0%</w:t>
       </w:r>
     </w:p>
     <w:p>
@@ -538,7 +538,7 @@
                 <w:color w:val="000000"/>
                 <w:sz w:val="19"/>
               </w:rPr>
-              <w:t>6.10 hr</w:t>
+              <w:t>6.60 hr</w:t>
             </w:r>
           </w:p>
         </w:tc>
@@ -756,7 +756,7 @@
                 <w:color w:val="000000"/>
                 <w:sz w:val="19"/>
               </w:rPr>
-              <w:t>4.50 hr</w:t>
+              <w:t>4.48 hr</w:t>
             </w:r>
           </w:p>
         </w:tc>
@@ -783,7 +783,7 @@
                 <w:color w:val="000000"/>
                 <w:sz w:val="19"/>
               </w:rPr>
-              <w:t>0.00 hr</w:t>
+              <w:t>1.55 hr</w:t>
             </w:r>
           </w:p>
         </w:tc>
@@ -810,7 +810,7 @@
                 <w:color w:val="000000"/>
                 <w:sz w:val="19"/>
               </w:rPr>
-              <w:t>0.0%</w:t>
+              <w:t>34.6%</w:t>
             </w:r>
           </w:p>
         </w:tc>
@@ -864,7 +864,7 @@
                 <w:color w:val="000000"/>
                 <w:sz w:val="19"/>
               </w:rPr>
-              <w:t>0.00 km</w:t>
+              <w:t>13.45 km</w:t>
             </w:r>
           </w:p>
         </w:tc>
@@ -891,7 +891,7 @@
                 <w:color w:val="000000"/>
                 <w:sz w:val="19"/>
               </w:rPr>
-              <w:t>0.0%</w:t>
+              <w:t>30.3%</w:t>
             </w:r>
           </w:p>
         </w:tc>
@@ -1550,7 +1550,7 @@
                 <w:color w:val="000000"/>
                 <w:sz w:val="19"/>
               </w:rPr>
-              <w:t>Bike: Recovery 45</w:t>
+              <w:t>Bike: 雨天備案：Threshold 9x3 (92%)</w:t>
             </w:r>
           </w:p>
         </w:tc>
@@ -1604,7 +1604,7 @@
                 <w:color w:val="000000"/>
                 <w:sz w:val="19"/>
               </w:rPr>
-              <w:t>45分</w:t>
+              <w:t>70分</w:t>
             </w:r>
           </w:p>
         </w:tc>
@@ -1797,7 +1797,7 @@
                 <w:color w:val="000000"/>
                 <w:sz w:val="19"/>
               </w:rPr>
-              <w:t>0分</w:t>
+              <w:t>93分 / 13.45km</w:t>
             </w:r>
           </w:p>
         </w:tc>
@@ -1824,7 +1824,7 @@
                 <w:color w:val="000000"/>
                 <w:sz w:val="19"/>
               </w:rPr>
-              <w:t>❌ 未執行/待排程</w:t>
+              <w:t>⚡ 超額完成 (116%, A)</w:t>
             </w:r>
           </w:p>
         </w:tc>
@@ -1882,7 +1882,7 @@
                 <w:color w:val="000000"/>
                 <w:sz w:val="19"/>
               </w:rPr>
-              <w:t>Bike: VO2 Max 2X8</w:t>
+              <w:t>Bike: Endurance</w:t>
             </w:r>
           </w:p>
         </w:tc>
@@ -1936,7 +1936,7 @@
                 <w:color w:val="000000"/>
                 <w:sz w:val="19"/>
               </w:rPr>
-              <w:t>40分</w:t>
+              <w:t>45分</w:t>
             </w:r>
           </w:p>
         </w:tc>
@@ -2434,7 +2434,7 @@
                 <w:color w:val="000000"/>
                 <w:sz w:val="19"/>
               </w:rPr>
-              <w:t>30分 / 5.00km</w:t>
+              <w:t>32分 / 5.00km</w:t>
             </w:r>
           </w:p>
         </w:tc>
@@ -3044,7 +3044,7 @@
                 <w:color w:val="000000"/>
                 <w:sz w:val="19"/>
               </w:rPr>
-              <w:t>Run: Easy 有氧跑 5:45~6:15</w:t>
+              <w:t>Run: 比賽配速 (本日重點)</w:t>
             </w:r>
           </w:p>
         </w:tc>
@@ -3098,7 +3098,7 @@
                 <w:color w:val="000000"/>
                 <w:sz w:val="19"/>
               </w:rPr>
-              <w:t>75分 / 12.50km</w:t>
+              <w:t>72分 / 12.50km</w:t>
             </w:r>
           </w:p>
         </w:tc>
@@ -3345,7 +3345,7 @@
     </w:p>
     <w:p>
       <w:r>
-        <w:t>• 當週累積自行車 0.00 km、跑步 0.00 km、游泳 0.00 km，整體時間執行率達 0.0%。</w:t>
+        <w:t>• 當週累積自行車 0.00 km、跑步 13.45 km、游泳 0.00 km，整體時間執行率達 11.0%。</w:t>
         <w:br/>
       </w:r>
       <w:r>

</xml_diff>

<commit_message>
Auto Daily 8:00 PM Dashboard Update [2026-10-07 20:00]
</commit_message>
<xml_diff>
--- a/docs/weekly/2026-W41_當週執行率回顧報告.docx
+++ b/docs/weekly/2026-W41_當週執行率回顧報告.docx
@@ -21,7 +21,7 @@
           <w:color w:val="555555"/>
           <w:sz w:val="20"/>
         </w:rPr>
-        <w:t>週期：2026/10/05–2026/10/11　｜　整體時間執行率：11.0%</w:t>
+        <w:t>週期：2026/10/05–2026/10/11　｜　整體時間執行率：18.6%</w:t>
       </w:r>
     </w:p>
     <w:p>
@@ -347,7 +347,7 @@
                 <w:color w:val="000000"/>
                 <w:sz w:val="19"/>
               </w:rPr>
-              <w:t>0.00 hr</w:t>
+              <w:t>1.07 hr</w:t>
             </w:r>
           </w:p>
         </w:tc>
@@ -374,7 +374,7 @@
                 <w:color w:val="000000"/>
                 <w:sz w:val="19"/>
               </w:rPr>
-              <w:t>0.0%</w:t>
+              <w:t>35.6%</w:t>
             </w:r>
           </w:p>
         </w:tc>
@@ -428,7 +428,7 @@
                 <w:color w:val="000000"/>
                 <w:sz w:val="19"/>
               </w:rPr>
-              <w:t>0.00 km</w:t>
+              <w:t>3.20 km</w:t>
             </w:r>
           </w:p>
         </w:tc>
@@ -455,7 +455,7 @@
                 <w:color w:val="000000"/>
                 <w:sz w:val="19"/>
               </w:rPr>
-              <w:t>0.0%</w:t>
+              <w:t>139.1%</w:t>
             </w:r>
           </w:p>
         </w:tc>
@@ -2129,7 +2129,7 @@
                 <w:color w:val="000000"/>
                 <w:sz w:val="19"/>
               </w:rPr>
-              <w:t>0分</w:t>
+              <w:t>64分 / 3.20km</w:t>
             </w:r>
           </w:p>
         </w:tc>
@@ -2156,7 +2156,7 @@
                 <w:color w:val="000000"/>
                 <w:sz w:val="19"/>
               </w:rPr>
-              <w:t>❌ 未執行/待排程</w:t>
+              <w:t>🟢 良好達標 (85%, A-)</w:t>
             </w:r>
           </w:p>
         </w:tc>
@@ -3345,7 +3345,7 @@
     </w:p>
     <w:p>
       <w:r>
-        <w:t>• 當週累積自行車 0.00 km、跑步 13.45 km、游泳 0.00 km，整體時間執行率達 11.0%。</w:t>
+        <w:t>• 當週累積自行車 0.00 km、跑步 13.45 km、游泳 3.20 km，整體時間執行率達 18.6%。</w:t>
         <w:br/>
       </w:r>
       <w:r>

</xml_diff>

<commit_message>
Auto Daily 8:00 PM Dashboard Update [2026-10-08 20:00]
</commit_message>
<xml_diff>
--- a/docs/weekly/2026-W41_當週執行率回顧報告.docx
+++ b/docs/weekly/2026-W41_當週執行率回顧報告.docx
@@ -21,7 +21,7 @@
           <w:color w:val="555555"/>
           <w:sz w:val="20"/>
         </w:rPr>
-        <w:t>週期：2026/10/05–2026/10/11　｜　整體時間執行率：18.6%</w:t>
+        <w:t>週期：2026/10/05–2026/10/11　｜　整體時間執行率：33.1%</w:t>
       </w:r>
     </w:p>
     <w:p>
@@ -565,7 +565,7 @@
                 <w:color w:val="000000"/>
                 <w:sz w:val="19"/>
               </w:rPr>
-              <w:t>0.00 hr</w:t>
+              <w:t>1.52 hr</w:t>
             </w:r>
           </w:p>
         </w:tc>
@@ -592,7 +592,7 @@
                 <w:color w:val="000000"/>
                 <w:sz w:val="19"/>
               </w:rPr>
-              <w:t>0.0%</w:t>
+              <w:t>23.0%</w:t>
             </w:r>
           </w:p>
         </w:tc>
@@ -646,7 +646,7 @@
                 <w:color w:val="000000"/>
                 <w:sz w:val="19"/>
               </w:rPr>
-              <w:t>0.00 km</w:t>
+              <w:t>47.73 km</w:t>
             </w:r>
           </w:p>
         </w:tc>
@@ -673,7 +673,7 @@
                 <w:color w:val="000000"/>
                 <w:sz w:val="19"/>
               </w:rPr>
-              <w:t>0.0%</w:t>
+              <w:t>47.7%</w:t>
             </w:r>
           </w:p>
         </w:tc>
@@ -783,7 +783,7 @@
                 <w:color w:val="000000"/>
                 <w:sz w:val="19"/>
               </w:rPr>
-              <w:t>1.55 hr</w:t>
+              <w:t>2.08 hr</w:t>
             </w:r>
           </w:p>
         </w:tc>
@@ -810,7 +810,7 @@
                 <w:color w:val="000000"/>
                 <w:sz w:val="19"/>
               </w:rPr>
-              <w:t>34.6%</w:t>
+              <w:t>46.5%</w:t>
             </w:r>
           </w:p>
         </w:tc>
@@ -864,7 +864,7 @@
                 <w:color w:val="000000"/>
                 <w:sz w:val="19"/>
               </w:rPr>
-              <w:t>13.45 km</w:t>
+              <w:t>19.56 km</w:t>
             </w:r>
           </w:p>
         </w:tc>
@@ -891,7 +891,7 @@
                 <w:color w:val="000000"/>
                 <w:sz w:val="19"/>
               </w:rPr>
-              <w:t>30.3%</w:t>
+              <w:t>44.1%</w:t>
             </w:r>
           </w:p>
         </w:tc>
@@ -2295,7 +2295,7 @@
                 <w:color w:val="000000"/>
                 <w:sz w:val="19"/>
               </w:rPr>
-              <w:t>0分</w:t>
+              <w:t>91分 / 47.73km</w:t>
             </w:r>
           </w:p>
         </w:tc>
@@ -2322,7 +2322,7 @@
                 <w:color w:val="000000"/>
                 <w:sz w:val="19"/>
               </w:rPr>
-              <w:t>❌ 未執行/待排程</w:t>
+              <w:t>✅ 精準達標 (100%, A+)</w:t>
             </w:r>
           </w:p>
         </w:tc>
@@ -2461,7 +2461,7 @@
                 <w:color w:val="000000"/>
                 <w:sz w:val="19"/>
               </w:rPr>
-              <w:t>0分</w:t>
+              <w:t>32分 / 6.11km</w:t>
             </w:r>
           </w:p>
         </w:tc>
@@ -2488,7 +2488,7 @@
                 <w:color w:val="000000"/>
                 <w:sz w:val="19"/>
               </w:rPr>
-              <w:t>❌ 未執行/待排程</w:t>
+              <w:t>✅ 精準達標 (100%, A+)</w:t>
             </w:r>
           </w:p>
         </w:tc>
@@ -3345,7 +3345,7 @@
     </w:p>
     <w:p>
       <w:r>
-        <w:t>• 當週累積自行車 0.00 km、跑步 13.45 km、游泳 3.20 km，整體時間執行率達 18.6%。</w:t>
+        <w:t>• 當週累積自行車 47.73 km、跑步 19.56 km、游泳 3.20 km，整體時間執行率達 33.1%。</w:t>
         <w:br/>
       </w:r>
       <w:r>

</xml_diff>

<commit_message>
Auto Daily 8:00 PM Dashboard Update [2026-10-09 20:00]
</commit_message>
<xml_diff>
--- a/docs/weekly/2026-W41_當週執行率回顧報告.docx
+++ b/docs/weekly/2026-W41_當週執行率回顧報告.docx
@@ -21,7 +21,7 @@
           <w:color w:val="555555"/>
           <w:sz w:val="20"/>
         </w:rPr>
-        <w:t>週期：2026/10/05–2026/10/11　｜　整體時間執行率：33.1%</w:t>
+        <w:t>週期：2026/10/05–2026/10/11　｜　整體時間執行率：41.3%</w:t>
       </w:r>
     </w:p>
     <w:p>
@@ -347,7 +347,7 @@
                 <w:color w:val="000000"/>
                 <w:sz w:val="19"/>
               </w:rPr>
-              <w:t>1.07 hr</w:t>
+              <w:t>2.22 hr</w:t>
             </w:r>
           </w:p>
         </w:tc>
@@ -374,7 +374,7 @@
                 <w:color w:val="000000"/>
                 <w:sz w:val="19"/>
               </w:rPr>
-              <w:t>35.6%</w:t>
+              <w:t>73.9%</w:t>
             </w:r>
           </w:p>
         </w:tc>
@@ -428,7 +428,7 @@
                 <w:color w:val="000000"/>
                 <w:sz w:val="19"/>
               </w:rPr>
-              <w:t>3.20 km</w:t>
+              <w:t>6.40 km</w:t>
             </w:r>
           </w:p>
         </w:tc>
@@ -455,7 +455,7 @@
                 <w:color w:val="000000"/>
                 <w:sz w:val="19"/>
               </w:rPr>
-              <w:t>139.1%</w:t>
+              <w:t>278.3%</w:t>
             </w:r>
           </w:p>
         </w:tc>
@@ -2627,7 +2627,7 @@
                 <w:color w:val="000000"/>
                 <w:sz w:val="19"/>
               </w:rPr>
-              <w:t>0分</w:t>
+              <w:t>69分 / 3.20km</w:t>
             </w:r>
           </w:p>
         </w:tc>
@@ -2654,7 +2654,7 @@
                 <w:color w:val="000000"/>
                 <w:sz w:val="19"/>
               </w:rPr>
-              <w:t>❌ 未執行/待排程</w:t>
+              <w:t>⚡ 超額完成 (115%, A)</w:t>
             </w:r>
           </w:p>
         </w:tc>
@@ -3345,7 +3345,7 @@
     </w:p>
     <w:p>
       <w:r>
-        <w:t>• 當週累積自行車 47.73 km、跑步 19.56 km、游泳 3.20 km，整體時間執行率達 33.1%。</w:t>
+        <w:t>• 當週累積自行車 47.73 km、跑步 19.56 km、游泳 6.40 km，整體時間執行率達 41.3%。</w:t>
         <w:br/>
       </w:r>
       <w:r>

</xml_diff>

<commit_message>
Auto Daily 8:00 PM Dashboard Update [2026-10-10 21:13]
</commit_message>
<xml_diff>
--- a/docs/weekly/2026-W41_當週執行率回顧報告.docx
+++ b/docs/weekly/2026-W41_當週執行率回顧報告.docx
@@ -21,7 +21,7 @@
           <w:color w:val="555555"/>
           <w:sz w:val="20"/>
         </w:rPr>
-        <w:t>週期：2026/10/05–2026/10/11　｜　整體時間執行率：41.3%</w:t>
+        <w:t>週期：2026/10/05–2026/10/11　｜　整體時間執行率：76.4%</w:t>
       </w:r>
     </w:p>
     <w:p>
@@ -565,7 +565,7 @@
                 <w:color w:val="000000"/>
                 <w:sz w:val="19"/>
               </w:rPr>
-              <w:t>1.52 hr</w:t>
+              <w:t>5.27 hr</w:t>
             </w:r>
           </w:p>
         </w:tc>
@@ -592,7 +592,7 @@
                 <w:color w:val="000000"/>
                 <w:sz w:val="19"/>
               </w:rPr>
-              <w:t>23.0%</w:t>
+              <w:t>79.8%</w:t>
             </w:r>
           </w:p>
         </w:tc>
@@ -646,7 +646,7 @@
                 <w:color w:val="000000"/>
                 <w:sz w:val="19"/>
               </w:rPr>
-              <w:t>47.73 km</w:t>
+              <w:t>149.15 km</w:t>
             </w:r>
           </w:p>
         </w:tc>
@@ -673,7 +673,7 @@
                 <w:color w:val="000000"/>
                 <w:sz w:val="19"/>
               </w:rPr>
-              <w:t>47.7%</w:t>
+              <w:t>149.2%</w:t>
             </w:r>
           </w:p>
         </w:tc>
@@ -783,7 +783,7 @@
                 <w:color w:val="000000"/>
                 <w:sz w:val="19"/>
               </w:rPr>
-              <w:t>2.08 hr</w:t>
+              <w:t>3.28 hr</w:t>
             </w:r>
           </w:p>
         </w:tc>
@@ -810,7 +810,7 @@
                 <w:color w:val="000000"/>
                 <w:sz w:val="19"/>
               </w:rPr>
-              <w:t>46.5%</w:t>
+              <w:t>73.2%</w:t>
             </w:r>
           </w:p>
         </w:tc>
@@ -864,7 +864,7 @@
                 <w:color w:val="000000"/>
                 <w:sz w:val="19"/>
               </w:rPr>
-              <w:t>19.56 km</w:t>
+              <w:t>30.93 km</w:t>
             </w:r>
           </w:p>
         </w:tc>
@@ -891,7 +891,7 @@
                 <w:color w:val="000000"/>
                 <w:sz w:val="19"/>
               </w:rPr>
-              <w:t>44.1%</w:t>
+              <w:t>69.7%</w:t>
             </w:r>
           </w:p>
         </w:tc>
@@ -2793,7 +2793,7 @@
                 <w:color w:val="000000"/>
                 <w:sz w:val="19"/>
               </w:rPr>
-              <w:t>0分</w:t>
+              <w:t>225分 / 101.42km</w:t>
             </w:r>
           </w:p>
         </w:tc>
@@ -2820,7 +2820,7 @@
                 <w:color w:val="000000"/>
                 <w:sz w:val="19"/>
               </w:rPr>
-              <w:t>❌ 未執行/待排程</w:t>
+              <w:t>⚡ 超額完成 (118%, A)</w:t>
             </w:r>
           </w:p>
         </w:tc>
@@ -2959,7 +2959,7 @@
                 <w:color w:val="000000"/>
                 <w:sz w:val="19"/>
               </w:rPr>
-              <w:t>0分</w:t>
+              <w:t>72分 / 11.37km</w:t>
             </w:r>
           </w:p>
         </w:tc>
@@ -2986,7 +2986,7 @@
                 <w:color w:val="000000"/>
                 <w:sz w:val="19"/>
               </w:rPr>
-              <w:t>❌ 未執行/待排程</w:t>
+              <w:t>🟢 良好達標 (85%, A-)</w:t>
             </w:r>
           </w:p>
         </w:tc>
@@ -3345,7 +3345,15 @@
     </w:p>
     <w:p>
       <w:r>
-        <w:t>• 當週累積自行車 47.73 km、跑步 19.56 km、游泳 6.40 km，整體時間執行率達 41.3%。</w:t>
+        <w:t>• 當週累積自行車 149.15 km、跑步 30.93 km、游泳 6.40 km，整體時間執行率達 76.4%。</w:t>
+        <w:br/>
+      </w:r>
+      <w:r>
+        <w:t>• 長距離單車扎實完成，左右踩踏發力極為平衡 (50.5% / 49.5%)，座艙穩定度高。</w:t>
+        <w:br/>
+      </w:r>
+      <w:r>
+        <w:t>• 順利完成 17.52 km 長跑（總爬升 +327m），平路河濱漸速至 5:26/km，上坡穩健控心率並自覺補水折返，下坡迅速拉高步頻收尾。</w:t>
         <w:br/>
       </w:r>
       <w:r>

</xml_diff>

<commit_message>
Auto Daily 8:00 PM Dashboard Update [2026-10-11 20:00]
</commit_message>
<xml_diff>
--- a/docs/weekly/2026-W41_當週執行率回顧報告.docx
+++ b/docs/weekly/2026-W41_當週執行率回顧報告.docx
@@ -21,7 +21,7 @@
           <w:color w:val="555555"/>
           <w:sz w:val="20"/>
         </w:rPr>
-        <w:t>週期：2026/10/05–2026/10/11　｜　整體時間執行率：76.4%</w:t>
+        <w:t>週期：2026/10/05–2026/10/11　｜　整體時間執行率：90.3%</w:t>
       </w:r>
     </w:p>
     <w:p>
@@ -347,7 +347,7 @@
                 <w:color w:val="000000"/>
                 <w:sz w:val="19"/>
               </w:rPr>
-              <w:t>2.22 hr</w:t>
+              <w:t>2.97 hr</w:t>
             </w:r>
           </w:p>
         </w:tc>
@@ -374,7 +374,7 @@
                 <w:color w:val="000000"/>
                 <w:sz w:val="19"/>
               </w:rPr>
-              <w:t>73.9%</w:t>
+              <w:t>98.9%</w:t>
             </w:r>
           </w:p>
         </w:tc>
@@ -428,7 +428,7 @@
                 <w:color w:val="000000"/>
                 <w:sz w:val="19"/>
               </w:rPr>
-              <w:t>6.40 km</w:t>
+              <w:t>8.80 km</w:t>
             </w:r>
           </w:p>
         </w:tc>
@@ -455,7 +455,7 @@
                 <w:color w:val="000000"/>
                 <w:sz w:val="19"/>
               </w:rPr>
-              <w:t>278.3%</w:t>
+              <w:t>382.6%</w:t>
             </w:r>
           </w:p>
         </w:tc>
@@ -783,7 +783,7 @@
                 <w:color w:val="000000"/>
                 <w:sz w:val="19"/>
               </w:rPr>
-              <w:t>3.28 hr</w:t>
+              <w:t>4.48 hr</w:t>
             </w:r>
           </w:p>
         </w:tc>
@@ -810,7 +810,7 @@
                 <w:color w:val="000000"/>
                 <w:sz w:val="19"/>
               </w:rPr>
-              <w:t>73.2%</w:t>
+              <w:t>100.0%</w:t>
             </w:r>
           </w:p>
         </w:tc>
@@ -864,7 +864,7 @@
                 <w:color w:val="000000"/>
                 <w:sz w:val="19"/>
               </w:rPr>
-              <w:t>30.93 km</w:t>
+              <w:t>44.20 km</w:t>
             </w:r>
           </w:p>
         </w:tc>
@@ -891,7 +891,7 @@
                 <w:color w:val="000000"/>
                 <w:sz w:val="19"/>
               </w:rPr>
-              <w:t>69.7%</w:t>
+              <w:t>99.5%</w:t>
             </w:r>
           </w:p>
         </w:tc>
@@ -3125,7 +3125,7 @@
                 <w:color w:val="000000"/>
                 <w:sz w:val="19"/>
               </w:rPr>
-              <w:t>0分</w:t>
+              <w:t>72分 / 13.27km</w:t>
             </w:r>
           </w:p>
         </w:tc>
@@ -3152,7 +3152,7 @@
                 <w:color w:val="000000"/>
                 <w:sz w:val="19"/>
               </w:rPr>
-              <w:t>❌ 未執行/待排程</w:t>
+              <w:t>✅ 精準達標 (100%, A+)</w:t>
             </w:r>
           </w:p>
         </w:tc>
@@ -3291,7 +3291,7 @@
                 <w:color w:val="000000"/>
                 <w:sz w:val="19"/>
               </w:rPr>
-              <w:t>0分</w:t>
+              <w:t>45分 / 2.40km</w:t>
             </w:r>
           </w:p>
         </w:tc>
@@ -3318,7 +3318,7 @@
                 <w:color w:val="000000"/>
                 <w:sz w:val="19"/>
               </w:rPr>
-              <w:t>❌ 未執行/待排程</w:t>
+              <w:t>✅ 精準達標 (100%, A+)</w:t>
             </w:r>
           </w:p>
         </w:tc>
@@ -3345,7 +3345,7 @@
     </w:p>
     <w:p>
       <w:r>
-        <w:t>• 當週累積自行車 149.15 km、跑步 30.93 km、游泳 6.40 km，整體時間執行率達 76.4%。</w:t>
+        <w:t>• 當週累積自行車 149.15 km、跑步 44.20 km、游泳 8.80 km，整體時間執行率達 90.3%。</w:t>
         <w:br/>
       </w:r>
       <w:r>
@@ -3354,6 +3354,10 @@
       </w:r>
       <w:r>
         <w:t>• 順利完成 17.52 km 長跑（總爬升 +327m），平路河濱漸速至 5:26/km，上坡穩健控心率並自覺補水折返，下坡迅速拉高步頻收尾。</w:t>
+        <w:br/>
+      </w:r>
+      <w:r>
+        <w:t>• 游泳實游 4,100m，雙組 1,600m 自由式持續游繳出 1:56~1:58/100m 高度一致均速與 140 bpm 穩定心率，水感極佳。</w:t>
         <w:br/>
       </w:r>
       <w:r>

</xml_diff>